<commit_message>
Updated commit with updated instructions.
</commit_message>
<xml_diff>
--- a/BAE587-Hmk5-instructions.docx
+++ b/BAE587-Hmk5-instructions.docx
@@ -382,6 +382,60 @@
     <w:p/>
     <w:p>
       <w:r>
+        <w:t xml:space="preserve">All instructions and documents are stored on the </w:t>
+      </w:r>
+      <w:proofErr w:type="spellStart"/>
+      <w:r>
+        <w:t>Github</w:t>
+      </w:r>
+      <w:proofErr w:type="spellEnd"/>
+      <w:r>
+        <w:t xml:space="preserve"> repository: </w:t>
+      </w:r>
+      <w:hyperlink r:id="rId7" w:history="1">
+        <w:r>
+          <w:rPr>
+            <w:rStyle w:val="Hyperlink"/>
+          </w:rPr>
+          <w:t>https://github.com/francoisbirgand/QClab587</w:t>
+        </w:r>
+      </w:hyperlink>
+      <w:r>
+        <w:t xml:space="preserve">. Go to this link. Click on the green “&lt;&gt; code” button and choose ‘download zip’. Unzip the file and place all the unzip files in a specific directory (e.g., BAE587-hmk5). </w:t>
+      </w:r>
+    </w:p>
+    <w:p/>
+    <w:p>
+      <w:r>
+        <w:t>O</w:t>
+      </w:r>
+      <w:r>
+        <w:t>pen and read the file “</w:t>
+      </w:r>
+      <w:r>
+        <w:t>BAE587-QCHmk5-usingR.pptx</w:t>
+      </w:r>
+      <w:r>
+        <w:t>”</w:t>
+      </w:r>
+      <w:r>
+        <w:t xml:space="preserve">. Many of the technical instructions are there to use RStudio. </w:t>
+      </w:r>
+      <w:proofErr w:type="spellStart"/>
+      <w:r>
+        <w:t>If</w:t>
+      </w:r>
+      <w:proofErr w:type="spellEnd"/>
+      <w:r>
+        <w:t xml:space="preserve"> you know nothing about R studio and R, </w:t>
+      </w:r>
+      <w:r>
+        <w:t>follow all instructions to download them. You may totally work in Python if you prefer and do the homework with it. In all cases, make sure you use the reproducible research platform.</w:t>
+      </w:r>
+    </w:p>
+    <w:p/>
+    <w:p>
+      <w:r>
         <w:t xml:space="preserve">In the </w:t>
       </w:r>
       <w:r>
@@ -402,70 +456,13 @@
         <w:t xml:space="preserve">give a quick lecture on what hydrographs are, and some tricks to calculate cumulative flow and loads. </w:t>
       </w:r>
       <w:r>
-        <w:t>am giving you quite a bit of code</w:t>
-      </w:r>
-      <w:r>
-        <w:t>, from which you can snip some exerts</w:t>
-      </w:r>
-      <w:r>
-        <w:t>.</w:t>
-      </w:r>
-      <w:r>
-        <w:t xml:space="preserve">  </w:t>
-      </w:r>
-      <w:r>
-        <w:t xml:space="preserve">This should </w:t>
-      </w:r>
-      <w:r>
-        <w:t xml:space="preserve">help you get </w:t>
-      </w:r>
-      <w:r>
-        <w:t xml:space="preserve">a head </w:t>
-      </w:r>
-      <w:proofErr w:type="gramStart"/>
-      <w:r>
-        <w:t>start</w:t>
-      </w:r>
-      <w:proofErr w:type="gramEnd"/>
-      <w:r>
-        <w:t xml:space="preserve"> and you do not have to invent the wheel again</w:t>
-      </w:r>
-      <w:r>
-        <w:t xml:space="preserve">. </w:t>
-      </w:r>
-      <w:r>
-        <w:t xml:space="preserve"> </w:t>
-      </w:r>
-      <w:r>
-        <w:t>This way</w:t>
-      </w:r>
-      <w:r>
-        <w:t xml:space="preserve"> you can </w:t>
-      </w:r>
-      <w:r>
-        <w:t xml:space="preserve">also </w:t>
-      </w:r>
-      <w:r>
-        <w:t xml:space="preserve">see how a </w:t>
-      </w:r>
-      <w:proofErr w:type="spellStart"/>
-      <w:r>
-        <w:t>Rmd</w:t>
-      </w:r>
-      <w:proofErr w:type="spellEnd"/>
-      <w:r>
-        <w:t xml:space="preserve"> file looks like, and how it might render when you ‘knit’ into an html file</w:t>
-      </w:r>
-      <w:r>
-        <w:t xml:space="preserve"> (see the PowerPoint presentation file to educate yourself about R, R Markdown or Quarto</w:t>
-      </w:r>
-      <w:r>
-        <w:t xml:space="preserve"> if </w:t>
+        <w:t>Borrow all the code you need to answer the homework questions.</w:t>
       </w:r>
     </w:p>
     <w:p/>
     <w:p>
       <w:r>
+        <w:lastRenderedPageBreak/>
         <w:t xml:space="preserve">The study watershed for this </w:t>
       </w:r>
       <w:r>
@@ -565,32 +562,212 @@
     </w:p>
     <w:p/>
     <w:p>
-      <w:r>
-        <w:t xml:space="preserve">The data is available at </w:t>
-      </w:r>
-    </w:p>
-    <w:p>
-      <w:hyperlink r:id="rId7" w:history="1">
+      <w:pPr>
+        <w:rPr>
+          <w:u w:val="single"/>
+        </w:rPr>
+      </w:pPr>
+      <w:r>
+        <w:rPr>
+          <w:u w:val="single"/>
+        </w:rPr>
+        <w:t>Exercise 1</w:t>
+      </w:r>
+      <w:r>
+        <w:rPr>
+          <w:u w:val="single"/>
+        </w:rPr>
+        <w:t xml:space="preserve"> (10 points)</w:t>
+      </w:r>
+      <w:r>
+        <w:rPr>
+          <w:u w:val="single"/>
+        </w:rPr>
+        <w:t xml:space="preserve">: </w:t>
+      </w:r>
+    </w:p>
+    <w:p>
+      <w:pPr>
+        <w:rPr>
+          <w:u w:val="single"/>
+        </w:rPr>
+      </w:pPr>
+    </w:p>
+    <w:p>
+      <w:r>
+        <w:t xml:space="preserve">Present and discuss your observations on </w:t>
+      </w:r>
+      <w:r>
+        <w:t xml:space="preserve">the yearly </w:t>
+      </w:r>
+      <w:r>
+        <w:t xml:space="preserve">2012-2013 </w:t>
+      </w:r>
+      <w:r>
+        <w:t xml:space="preserve">hydrograph for the </w:t>
+      </w:r>
+      <w:r>
+        <w:t>Chickasaw River at Franklin, Ohio</w:t>
+      </w:r>
+      <w:r>
+        <w:t xml:space="preserve">. </w:t>
+      </w:r>
+    </w:p>
+    <w:p/>
+    <w:p>
+      <w:r>
+        <w:t>You may borrow and</w:t>
+      </w:r>
+      <w:r>
+        <w:t xml:space="preserve"> modify the code available</w:t>
+      </w:r>
+      <w:r>
+        <w:t xml:space="preserve"> given in </w:t>
+      </w:r>
+      <w:r>
+        <w:t>“</w:t>
+      </w:r>
+      <w:r>
+        <w:t>BAE587-QC-lecture-and-</w:t>
+      </w:r>
+      <w:proofErr w:type="gramStart"/>
+      <w:r>
+        <w:t>code.Rmd</w:t>
+      </w:r>
+      <w:proofErr w:type="gramEnd"/>
+      <w:r>
+        <w:t>”</w:t>
+      </w:r>
+      <w:r>
+        <w:t xml:space="preserve"> to answer the question.</w:t>
+      </w:r>
+    </w:p>
+    <w:p/>
+    <w:p>
+      <w:r>
+        <w:t>For the discussion, t</w:t>
+      </w:r>
+      <w:r>
+        <w:t xml:space="preserve">hink about seasonality (or lack thereof) of baseflow, of the </w:t>
+      </w:r>
+      <w:r>
+        <w:t xml:space="preserve">relative </w:t>
+      </w:r>
+      <w:r>
+        <w:t>magnitude of flow peaks</w:t>
+      </w:r>
+      <w:r>
+        <w:t xml:space="preserve"> compared to base flow just before peaks</w:t>
+      </w:r>
+      <w:r>
+        <w:t>. Propose possible reasons for your observations</w:t>
+      </w:r>
+      <w:r>
+        <w:t xml:space="preserve"> (hint: the description of the watershed should help you)</w:t>
+      </w:r>
+      <w:r>
+        <w:t>.</w:t>
+      </w:r>
+    </w:p>
+    <w:p/>
+    <w:p>
+      <w:pPr>
+        <w:rPr>
+          <w:u w:val="single"/>
+        </w:rPr>
+      </w:pPr>
+      <w:r>
+        <w:rPr>
+          <w:u w:val="single"/>
+        </w:rPr>
+        <w:t>Exercise 2</w:t>
+      </w:r>
+      <w:r>
+        <w:rPr>
+          <w:u w:val="single"/>
+        </w:rPr>
+        <w:t xml:space="preserve"> (20 points)</w:t>
+      </w:r>
+      <w:r>
+        <w:rPr>
+          <w:u w:val="single"/>
+        </w:rPr>
+        <w:t xml:space="preserve">: </w:t>
+      </w:r>
+    </w:p>
+    <w:p>
+      <w:pPr>
+        <w:rPr>
+          <w:u w:val="single"/>
+        </w:rPr>
+      </w:pPr>
+    </w:p>
+    <w:p>
+      <w:r>
+        <w:t xml:space="preserve">Calculate </w:t>
+      </w:r>
+      <w:r>
+        <w:t xml:space="preserve">and report </w:t>
+      </w:r>
+      <w:r>
+        <w:t xml:space="preserve">the lowest, highest, mean, and median flow rates, as well as the 10th percentile, and the 90th percentile. For this, there is the quantile function, which works as </w:t>
+      </w:r>
+      <w:proofErr w:type="gramStart"/>
+      <w:r>
+        <w:rPr>
+          <w:shd w:val="clear" w:color="auto" w:fill="A6A6A6" w:themeFill="background1" w:themeFillShade="A6"/>
+        </w:rPr>
+        <w:t>quantile(</w:t>
+      </w:r>
+      <w:proofErr w:type="spellStart"/>
+      <w:r>
+        <w:rPr>
+          <w:shd w:val="clear" w:color="auto" w:fill="A6A6A6" w:themeFill="background1" w:themeFillShade="A6"/>
+        </w:rPr>
+        <w:t>Q,percentile</w:t>
+      </w:r>
+      <w:proofErr w:type="spellEnd"/>
+      <w:proofErr w:type="gramEnd"/>
+      <w:r>
+        <w:rPr>
+          <w:shd w:val="clear" w:color="auto" w:fill="A6A6A6" w:themeFill="background1" w:themeFillShade="A6"/>
+        </w:rPr>
+        <w:t xml:space="preserve"> value)</w:t>
+      </w:r>
+      <w:r>
+        <w:t>.</w:t>
+      </w:r>
+    </w:p>
+    <w:p/>
+    <w:p>
+      <w:r>
+        <w:t>Report them in a bullet list</w:t>
+      </w:r>
+      <w:r>
+        <w:t xml:space="preserve"> (you may read </w:t>
+      </w:r>
+      <w:hyperlink r:id="rId8" w:history="1">
         <w:r>
           <w:rPr>
             <w:rStyle w:val="Hyperlink"/>
           </w:rPr>
-          <w:t>https://raw.githubusercontent.com/francoisbirgand/</w:t>
-        </w:r>
-        <w:r>
-          <w:rPr>
-            <w:rStyle w:val="Hyperlink"/>
-            <w:highlight w:val="yellow"/>
-          </w:rPr>
-          <w:t>BAE204-</w:t>
-        </w:r>
-        <w:r>
-          <w:rPr>
-            <w:rStyle w:val="Hyperlink"/>
-          </w:rPr>
-          <w:t>Qlab/master/Lin_1h_cuyahoga_all_2008-2009_SI_ref.csv</w:t>
+          <w:t>this crash course on R markdown</w:t>
         </w:r>
       </w:hyperlink>
+      <w:r>
+        <w:t xml:space="preserve"> to help you for the </w:t>
+      </w:r>
+      <w:proofErr w:type="spellStart"/>
+      <w:r>
+        <w:t>synthax</w:t>
+      </w:r>
+      <w:proofErr w:type="spellEnd"/>
+      <w:r>
+        <w:t>)</w:t>
+      </w:r>
+      <w:r>
+        <w:t>.</w:t>
+      </w:r>
     </w:p>
     <w:p/>
     <w:p>
@@ -603,19 +780,19 @@
         <w:rPr>
           <w:u w:val="single"/>
         </w:rPr>
-        <w:t>Exercise 1</w:t>
+        <w:t>Exercise 3</w:t>
       </w:r>
       <w:r>
         <w:rPr>
           <w:u w:val="single"/>
         </w:rPr>
-        <w:t xml:space="preserve"> (10 points)</w:t>
+        <w:t xml:space="preserve"> (20 points)</w:t>
       </w:r>
       <w:r>
         <w:rPr>
           <w:u w:val="single"/>
         </w:rPr>
-        <w:t xml:space="preserve">: </w:t>
+        <w:t>:</w:t>
       </w:r>
     </w:p>
     <w:p>
@@ -627,221 +804,24 @@
     </w:p>
     <w:p>
       <w:r>
-        <w:t xml:space="preserve">Present and discuss your observations on </w:t>
-      </w:r>
-      <w:r>
-        <w:t xml:space="preserve">the yearly </w:t>
-      </w:r>
-      <w:r>
-        <w:t xml:space="preserve">2012-2013 </w:t>
-      </w:r>
-      <w:r>
-        <w:t xml:space="preserve">hydrograph for the </w:t>
-      </w:r>
-      <w:r>
-        <w:t>Chickasaw River at Franklin, Ohio</w:t>
-      </w:r>
-      <w:r>
-        <w:t xml:space="preserve">. </w:t>
-      </w:r>
-    </w:p>
-    <w:p>
-      <w:r>
-        <w:t>You may write your own code or</w:t>
-      </w:r>
-      <w:r>
-        <w:t xml:space="preserve"> </w:t>
-      </w:r>
-      <w:r>
-        <w:t xml:space="preserve">go into the </w:t>
-      </w:r>
-      <w:r>
-        <w:t>“</w:t>
-      </w:r>
-      <w:r>
-        <w:t>BAE</w:t>
-      </w:r>
-      <w:r>
-        <w:t>587</w:t>
-      </w:r>
-      <w:r>
-        <w:t>-</w:t>
-      </w:r>
-      <w:r>
-        <w:t>Hmk5</w:t>
-      </w:r>
-      <w:r>
-        <w:t>.Rmd</w:t>
-      </w:r>
-      <w:r>
-        <w:t>”</w:t>
-      </w:r>
-      <w:r>
-        <w:t xml:space="preserve"> </w:t>
-      </w:r>
-      <w:proofErr w:type="gramStart"/>
-      <w:r>
-        <w:t>document, and</w:t>
-      </w:r>
-      <w:proofErr w:type="gramEnd"/>
-      <w:r>
-        <w:t xml:space="preserve"> modify the code available </w:t>
-      </w:r>
-      <w:hyperlink r:id="rId8" w:anchor="actual-hydrograph-over-an-entire-year" w:history="1">
-        <w:r>
-          <w:rPr>
-            <w:rStyle w:val="Hyperlink"/>
-          </w:rPr>
-          <w:t>https://francoisbirgand.github.io/BAE-587/introduction-to-hydrographs-chemographs-concentrations-and-loads.html#actual-hydrograph-over-an-entire-year</w:t>
-        </w:r>
-      </w:hyperlink>
-      <w:r>
-        <w:t xml:space="preserve"> into the first chunk to obtain your result. </w:t>
-      </w:r>
-    </w:p>
-    <w:p/>
-    <w:p>
-      <w:r>
-        <w:t>For the discussion, t</w:t>
-      </w:r>
-      <w:r>
-        <w:t xml:space="preserve">hink about seasonality (or lack thereof) of baseflow, of the </w:t>
-      </w:r>
-      <w:r>
-        <w:t xml:space="preserve">relative </w:t>
-      </w:r>
-      <w:r>
-        <w:t>magnitude of flow peaks</w:t>
-      </w:r>
-      <w:r>
-        <w:t xml:space="preserve"> compared to base flow just before peaks</w:t>
-      </w:r>
-      <w:r>
-        <w:t>. Propose possible reasons for your observations</w:t>
-      </w:r>
-      <w:r>
-        <w:t xml:space="preserve"> (hint: the description of the watershed should help you)</w:t>
-      </w:r>
-      <w:r>
-        <w:t>.</w:t>
-      </w:r>
-    </w:p>
-    <w:p/>
-    <w:p>
-      <w:pPr>
-        <w:rPr>
-          <w:u w:val="single"/>
-        </w:rPr>
-      </w:pPr>
-      <w:r>
-        <w:rPr>
-          <w:u w:val="single"/>
-        </w:rPr>
-        <w:t>Exercise 2</w:t>
-      </w:r>
-      <w:r>
-        <w:rPr>
-          <w:u w:val="single"/>
-        </w:rPr>
-        <w:t xml:space="preserve"> (20 points)</w:t>
-      </w:r>
-      <w:r>
-        <w:rPr>
-          <w:u w:val="single"/>
-        </w:rPr>
-        <w:t xml:space="preserve">: </w:t>
-      </w:r>
-    </w:p>
-    <w:p>
-      <w:pPr>
-        <w:rPr>
-          <w:u w:val="single"/>
-        </w:rPr>
-      </w:pPr>
-    </w:p>
-    <w:p>
-      <w:r>
-        <w:t xml:space="preserve">Calculate </w:t>
-      </w:r>
-      <w:r>
-        <w:t xml:space="preserve">and report </w:t>
-      </w:r>
-      <w:r>
-        <w:t xml:space="preserve">the lowest, highest, mean, and median flow rates, as well as the 10th percentile, and the 90th percentile. For this, there is the quantile function, which works as </w:t>
-      </w:r>
-      <w:proofErr w:type="gramStart"/>
-      <w:r>
-        <w:rPr>
-          <w:shd w:val="clear" w:color="auto" w:fill="A6A6A6" w:themeFill="background1" w:themeFillShade="A6"/>
-        </w:rPr>
-        <w:t>quantile(</w:t>
-      </w:r>
-      <w:proofErr w:type="spellStart"/>
-      <w:r>
-        <w:rPr>
-          <w:shd w:val="clear" w:color="auto" w:fill="A6A6A6" w:themeFill="background1" w:themeFillShade="A6"/>
-        </w:rPr>
-        <w:t>Q,percentile</w:t>
-      </w:r>
-      <w:proofErr w:type="spellEnd"/>
-      <w:proofErr w:type="gramEnd"/>
-      <w:r>
-        <w:rPr>
-          <w:shd w:val="clear" w:color="auto" w:fill="A6A6A6" w:themeFill="background1" w:themeFillShade="A6"/>
-        </w:rPr>
-        <w:t xml:space="preserve"> value)</w:t>
-      </w:r>
-      <w:r>
-        <w:t>.</w:t>
-      </w:r>
-    </w:p>
-    <w:p/>
-    <w:p>
-      <w:r>
-        <w:t>Report them in a bullet list.</w:t>
-      </w:r>
-    </w:p>
-    <w:p/>
-    <w:p>
-      <w:pPr>
-        <w:rPr>
-          <w:u w:val="single"/>
-        </w:rPr>
-      </w:pPr>
-      <w:r>
-        <w:rPr>
-          <w:u w:val="single"/>
-        </w:rPr>
-        <w:t>Exercise 3</w:t>
-      </w:r>
-      <w:r>
-        <w:rPr>
-          <w:u w:val="single"/>
-        </w:rPr>
-        <w:t xml:space="preserve"> (20 points)</w:t>
-      </w:r>
-      <w:r>
-        <w:rPr>
-          <w:u w:val="single"/>
-        </w:rPr>
-        <w:t>:</w:t>
-      </w:r>
-    </w:p>
-    <w:p>
-      <w:pPr>
-        <w:rPr>
-          <w:u w:val="single"/>
-        </w:rPr>
-      </w:pPr>
-    </w:p>
-    <w:p>
-      <w:r>
-        <w:t>Calculate and report the arithmetic average and medium concentrations for nitrate, TP, SRP, and TSS over the entire year of record.</w:t>
-      </w:r>
-    </w:p>
-    <w:p>
-      <w:r>
-        <w:t>List reference concentration values seen in lecture and c</w:t>
+        <w:t>Calculate and report the arithmetic average and medi</w:t>
+      </w:r>
+      <w:r>
+        <w:t>an</w:t>
+      </w:r>
+      <w:r>
+        <w:t xml:space="preserve"> concentrations for nitrate, TP, SRP, and TSS over the entire year of record.</w:t>
+      </w:r>
+    </w:p>
+    <w:p>
+      <w:r>
+        <w:t xml:space="preserve">List reference concentration values </w:t>
+      </w:r>
+      <w:r>
+        <w:t xml:space="preserve">for agricultural watersheds </w:t>
+      </w:r>
+      <w:r>
+        <w:t>seen in lecture and c</w:t>
       </w:r>
       <w:r>
         <w:t xml:space="preserve">ompare your results to </w:t>
@@ -3692,6 +3672,18 @@
       <w:shd w:val="clear" w:color="auto" w:fill="E1DFDD"/>
     </w:rPr>
   </w:style>
+  <w:style w:type="character" w:styleId="FollowedHyperlink">
+    <w:name w:val="FollowedHyperlink"/>
+    <w:basedOn w:val="DefaultParagraphFont"/>
+    <w:uiPriority w:val="99"/>
+    <w:semiHidden/>
+    <w:unhideWhenUsed/>
+    <w:rsid w:val="008313BD"/>
+    <w:rPr>
+      <w:color w:val="954F72" w:themeColor="followedHyperlink"/>
+      <w:u w:val="single"/>
+    </w:rPr>
+  </w:style>
 </w:styles>
 </file>
 

</xml_diff>

<commit_message>
upload updated instructions in word
</commit_message>
<xml_diff>
--- a/BAE587-Hmk5-instructions.docx
+++ b/BAE587-Hmk5-instructions.docx
@@ -86,48 +86,6 @@
           <w:sz w:val="28"/>
         </w:rPr>
       </w:pPr>
-    </w:p>
-    <w:p>
-      <w:pPr>
-        <w:pBdr>
-          <w:bottom w:val="single" w:sz="12" w:space="2" w:color="auto"/>
-        </w:pBdr>
-      </w:pPr>
-      <w:r>
-        <w:t xml:space="preserve">The entire code for the </w:t>
-      </w:r>
-      <w:r>
-        <w:t>homework</w:t>
-      </w:r>
-      <w:r>
-        <w:t xml:space="preserve"> is in the “</w:t>
-      </w:r>
-      <w:r>
-        <w:t>BAE</w:t>
-      </w:r>
-      <w:r>
-        <w:t>587</w:t>
-      </w:r>
-      <w:r>
-        <w:t>-QClab</w:t>
-      </w:r>
-      <w:r>
-        <w:t>-code</w:t>
-      </w:r>
-      <w:r>
-        <w:t>-</w:t>
-      </w:r>
-      <w:proofErr w:type="gramStart"/>
-      <w:r>
-        <w:t>examples</w:t>
-      </w:r>
-      <w:r>
-        <w:t>.Rmd</w:t>
-      </w:r>
-      <w:proofErr w:type="gramEnd"/>
-      <w:r>
-        <w:t>”.</w:t>
-      </w:r>
     </w:p>
     <w:p>
       <w:pPr>
@@ -407,27 +365,16 @@
     <w:p/>
     <w:p>
       <w:r>
-        <w:t>O</w:t>
-      </w:r>
-      <w:r>
-        <w:t>pen and read the file “</w:t>
+        <w:t>Open and read the file “</w:t>
       </w:r>
       <w:r>
         <w:t>BAE587-QCHmk5-usingR.pptx</w:t>
       </w:r>
       <w:r>
-        <w:t>”</w:t>
-      </w:r>
-      <w:r>
-        <w:t xml:space="preserve">. Many of the technical instructions are there to use RStudio. </w:t>
-      </w:r>
-      <w:proofErr w:type="spellStart"/>
-      <w:r>
-        <w:t>If</w:t>
-      </w:r>
-      <w:proofErr w:type="spellEnd"/>
-      <w:r>
-        <w:t xml:space="preserve"> you know nothing about R studio and R, </w:t>
+        <w:t xml:space="preserve">”. Many of the technical instructions are there to use RStudio. </w:t>
+      </w:r>
+      <w:r>
+        <w:t xml:space="preserve">If you know nothing about R studio and R, </w:t>
       </w:r>
       <w:r>
         <w:t>follow all instructions to download them. You may totally work in Python if you prefer and do the homework with it. In all cases, make sure you use the reproducible research platform.</w:t>
@@ -625,10 +572,7 @@
         <w:t xml:space="preserve"> given in </w:t>
       </w:r>
       <w:r>
-        <w:t>“</w:t>
-      </w:r>
-      <w:r>
-        <w:t>BAE587-QC-lecture-and-</w:t>
+        <w:t>“BAE587-QC-lecture-and-</w:t>
       </w:r>
       <w:proofErr w:type="gramStart"/>
       <w:r>
@@ -636,10 +580,7 @@
       </w:r>
       <w:proofErr w:type="gramEnd"/>
       <w:r>
-        <w:t>”</w:t>
-      </w:r>
-      <w:r>
-        <w:t xml:space="preserve"> to answer the question.</w:t>
+        <w:t>” to answer the question.</w:t>
       </w:r>
     </w:p>
     <w:p/>

</xml_diff>